<commit_message>
docs(bible): Volume 13 says 24 disciplines, not 23, now that Pleasure Driving is in (Equoria-0lx31)
One-time edit made with the owner's explicit permission on 2026-10-23 ('You may
correct the 23-discipline in the EquoriaBible this one time'). Exactly four
phrases change from '23-discipline' to '24-discipline' in
EquoriaBible/13_Competitions_Shows_Event_Scoring_DEEP.docx and in its markdown
mirror docs/features/13_Competitions_shows_Event_Scoring_DEEP.md; nothing else.

Co-Authored-By: Claude Opus 5.5 <noreply@anthropic.com>
Claude-Session: https://claude.ai/code/session_012E4iYjGQoiQfY6srjz6eQe
</commit_message>
<xml_diff>
--- a/EquoriaBible/13_Competitions_Shows_Event_Scoring_DEEP.docx
+++ b/EquoriaBible/13_Competitions_Shows_Event_Scoring_DEEP.docx
@@ -67,7 +67,7 @@
                 <w:color w:val="17233A"/>
               </w:rPr>
               <w:br/>
-              <w:t>Reconstructs Equoria’s competition engine in detail: eligibility and search, show hosting, exact 23-discipline stat-weight map, score components, riders/health/luck, prizes/stat gains/player XP, up to three active competition types with unlimited eligible show entries within those types, result history, conformation/parade systems and special Cups/events.</w:t>
+              <w:t>Reconstructs Equoria’s competition engine in detail: eligibility and search, show hosting, exact 24-discipline stat-weight map, score components, riders/health/luck, prizes/stat gains/player XP, up to three active competition types with unlimited eligible show entries within those types, result history, conformation/parade systems and special Cups/events.</w:t>
             </w:r>
           </w:p>
         </w:tc>
@@ -281,7 +281,7 @@
               <w:rPr>
                 <w:sz w:val="19"/>
               </w:rPr>
-              <w:t>23-discipline 50/30/20 stat map; rider ±; luck ±1–10; prizes 50/30/20; Horse Points 1/3/5/10 by result; seasonal game events double Horse Points.</w:t>
+              <w:t>24-discipline 50/30/20 stat map; rider ±; luck ±1–10; prizes 50/30/20; Horse Points 1/3/5/10 by result; seasonal game events double Horse Points.</w:t>
             </w:r>
           </w:p>
         </w:tc>
@@ -4194,7 +4194,7 @@
               <w:rPr>
                 <w:sz w:val="19"/>
               </w:rPr>
-              <w:t>Use the explicit 23-discipline flat list and 50/30/20 map. Do not reintroduce a generic weekly horse competition cooldown or energy bar. Do not group disciplines into Western/English categories in the player selection list. Keep discipline competition, conformation and parade scoring separate. Bounded luck must not overwhelm breeding/training/rider strategy.</w:t>
+              <w:t>Use the explicit 24-discipline flat list and 50/30/20 map. Do not reintroduce a generic weekly horse competition cooldown or energy bar. Do not group disciplines into Western/English categories in the player selection list. Keep discipline competition, conformation and parade scoring separate. Bounded luck must not overwhelm breeding/training/rider strategy.</w:t>
             </w:r>
           </w:p>
         </w:tc>
@@ -4491,7 +4491,7 @@
         <w:t xml:space="preserve">[RECOVERED-CANON] </w:t>
       </w:r>
       <w:r>
-        <w:t>The first bible preserves the 23-discipline 50/30/20 primary-stat map and later competition rules. That map remains the baseline unless a discipline receives an explicit revision.</w:t>
+        <w:t>The first bible preserves the 24-discipline 50/30/20 primary-stat map and later competition rules. That map remains the baseline unless a discipline receives an explicit revision.</w:t>
       </w:r>
     </w:p>
     <w:p>

</xml_diff>